<commit_message>
Correct response wording and Word rendering
</commit_message>
<xml_diff>
--- a/papers/CQG_116364_SUBMIT_THESE_5_FILES/CQG_116364_response_to_referees.docx
+++ b/papers/CQG_116364_SUBMIT_THESE_5_FILES/CQG_116364_response_to_referees.docx
@@ -1037,160 +1037,8 @@
       <w:r>
         <w:t xml:space="preserve"> </w:t>
       </w:r>
-      <m:oMath>
-        <m:sSub>
-          <m:e>
-            <m:r>
-              <m:rPr>
-                <m:sty m:val="p"/>
-              </m:rPr>
-              <m:t>Δ</m:t>
-            </m:r>
-          </m:e>
-          <m:sub>
-            <m:r>
-              <m:rPr>
-                <m:sty m:val="p"/>
-              </m:rPr>
-              <m:t>r</m:t>
-            </m:r>
-            <m:r>
-              <m:rPr>
-                <m:sty m:val="p"/>
-              </m:rPr>
-              <m:t>e</m:t>
-            </m:r>
-            <m:r>
-              <m:rPr>
-                <m:sty m:val="p"/>
-              </m:rPr>
-              <m:t>l</m:t>
-            </m:r>
-          </m:sub>
-        </m:sSub>
-        <m:r>
-          <m:rPr>
-            <m:sty m:val="p"/>
-          </m:rPr>
-          <m:t>(</m:t>
-        </m:r>
-        <m:sSub>
-          <m:e>
-            <m:r>
-              <m:t>ω</m:t>
-            </m:r>
-          </m:e>
-          <m:sub>
-            <m:r>
-              <m:t>1</m:t>
-            </m:r>
-          </m:sub>
-        </m:sSub>
-        <m:r>
-          <m:rPr>
-            <m:sty m:val="p"/>
-          </m:rPr>
-          <m:t>,</m:t>
-        </m:r>
-        <m:sSub>
-          <m:e>
-            <m:r>
-              <m:t>ω</m:t>
-            </m:r>
-          </m:e>
-          <m:sub>
-            <m:r>
-              <m:t>2</m:t>
-            </m:r>
-          </m:sub>
-        </m:sSub>
-        <m:r>
-          <m:rPr>
-            <m:sty m:val="p"/>
-          </m:rPr>
-          <m:t>)</m:t>
-        </m:r>
-        <m:r>
-          <m:rPr>
-            <m:sty m:val="p"/>
-          </m:rPr>
-          <m:t>=</m:t>
-        </m:r>
-        <m:r>
-          <m:rPr>
-            <m:sty m:val="p"/>
-          </m:rPr>
-          <m:t>|</m:t>
-        </m:r>
-        <m:sSub>
-          <m:e>
-            <m:r>
-              <m:t>ω</m:t>
-            </m:r>
-          </m:e>
-          <m:sub>
-            <m:r>
-              <m:t>1</m:t>
-            </m:r>
-          </m:sub>
-        </m:sSub>
-        <m:r>
-          <m:rPr>
-            <m:sty m:val="p"/>
-          </m:rPr>
-          <m:t>−</m:t>
-        </m:r>
-        <m:sSub>
-          <m:e>
-            <m:r>
-              <m:t>ω</m:t>
-            </m:r>
-          </m:e>
-          <m:sub>
-            <m:r>
-              <m:t>2</m:t>
-            </m:r>
-          </m:sub>
-        </m:sSub>
-        <m:r>
-          <m:rPr>
-            <m:sty m:val="p"/>
-          </m:rPr>
-          <m:t>|</m:t>
-        </m:r>
-        <m:r>
-          <m:rPr>
-            <m:sty m:val="p"/>
-          </m:rPr>
-          <m:t>/</m:t>
-        </m:r>
-        <m:r>
-          <m:rPr>
-            <m:sty m:val="p"/>
-          </m:rPr>
-          <m:t>|</m:t>
-        </m:r>
-        <m:sSub>
-          <m:e>
-            <m:r>
-              <m:t>ω</m:t>
-            </m:r>
-          </m:e>
-          <m:sub>
-            <m:r>
-              <m:t>2</m:t>
-            </m:r>
-          </m:sub>
-        </m:sSub>
-        <m:r>
-          <m:rPr>
-            <m:sty m:val="p"/>
-          </m:rPr>
-          <m:t>|</m:t>
-        </m:r>
-      </m:oMath>
-      <w:r>
-        <w:t xml:space="preserve">,</w:t>
+      <w:r>
+        <w:t xml:space="preserve">Δrel(ω₁, ω₂) = |ω₁ − ω₂|/|ω₂|,</w:t>
       </w:r>
       <w:r>
         <w:t xml:space="preserve"> </w:t>
@@ -1843,13 +1691,19 @@
         <w:t xml:space="preserve"> </w:t>
       </w:r>
       <w:r>
-        <w:t xml:space="preserve">complete derivation is supplied” and supplied that derivation. The revision now</w:t>
-      </w:r>
-      <w:r>
-        <w:t xml:space="preserve"> </w:t>
-      </w:r>
-      <w:r>
-        <w:t xml:space="preserve">uses the general sourced gauge-invariant odd-parity formalism for spherical</w:t>
+        <w:t xml:space="preserve">complete derivation is supplied” and supplied a more complete gauge-invariant</w:t>
+      </w:r>
+      <w:r>
+        <w:t xml:space="preserve"> </w:t>
+      </w:r>
+      <w:r>
+        <w:t xml:space="preserve">derivation under an explicit inverse-Cowling closure. The revision now uses the</w:t>
+      </w:r>
+      <w:r>
+        <w:t xml:space="preserve"> </w:t>
+      </w:r>
+      <w:r>
+        <w:t xml:space="preserve">general sourced gauge-invariant odd-parity formalism for spherical</w:t>
       </w:r>
       <w:r>
         <w:t xml:space="preserve"> </w:t>
@@ -2077,43 +1931,81 @@
         <w:t xml:space="preserve"> </w:t>
       </w:r>
       <w:r>
-        <w:t xml:space="preserve">disclaimer: the lapse-substitution toy model has been removed. Revised</w:t>
-      </w:r>
-      <w:r>
-        <w:t xml:space="preserve"> </w:t>
-      </w:r>
-      <w:r>
-        <w:t xml:space="preserve">Section 2.1 begins with the general sourced gauge-invariant odd-parity equation for the</w:t>
-      </w:r>
-      <w:r>
-        <w:t xml:space="preserve"> </w:t>
-      </w:r>
-      <w:r>
-        <w:t xml:space="preserve">effective KS background, displays the density/pressure terms missing from the</w:t>
-      </w:r>
-      <w:r>
-        <w:t xml:space="preserve"> </w:t>
-      </w:r>
-      <w:r>
-        <w:t xml:space="preserve">toy model, and gives the explicit correction relative to the old potential.</w:t>
-      </w:r>
-      <w:r>
-        <w:t xml:space="preserve"> </w:t>
-      </w:r>
-      <w:r>
-        <w:t xml:space="preserve">Immediately after the result we impose an explicitly additional</w:t>
-      </w:r>
-      <w:r>
-        <w:t xml:space="preserve"> </w:t>
-      </w:r>
-      <w:r>
-        <w:t xml:space="preserve">inverse-Cowling closure, whereas a theory that dynamically quantizes nonspherical</w:t>
-      </w:r>
-      <w:r>
-        <w:t xml:space="preserve"> </w:t>
-      </w:r>
-      <w:r>
-        <w:t xml:space="preserve">source modes could add source terms or couplings.</w:t>
+        <w:t xml:space="preserve">disclaimer: the lapse-substitution toy model has been removed as the working</w:t>
+      </w:r>
+      <w:r>
+        <w:t xml:space="preserve"> </w:t>
+      </w:r>
+      <w:r>
+        <w:t xml:space="preserve">axial model and is retained only as the explicitly labelled comparison</w:t>
+      </w:r>
+      <w:r>
+        <w:t xml:space="preserve"> </w:t>
+      </w:r>
+      <w:r>
+        <w:t xml:space="preserve">potential in Equation (17). Revised Section 2.1 starts from the general sourced</w:t>
+      </w:r>
+      <w:r>
+        <w:t xml:space="preserve"> </w:t>
+      </w:r>
+      <w:r>
+        <w:t xml:space="preserve">gauge-invariant odd-parity equation, imposes the additional inverse-Cowling</w:t>
+      </w:r>
+      <w:r>
+        <w:t xml:space="preserve"> </w:t>
+      </w:r>
+      <w:r>
+        <w:t xml:space="preserve">closure</w:t>
+      </w:r>
+      <w:r>
+        <w:t xml:space="preserve"> </w:t>
+      </w:r>
+      <m:oMath>
+        <m:sSub>
+          <m:e>
+            <m:r>
+              <m:t>L</m:t>
+            </m:r>
+          </m:e>
+          <m:sub>
+            <m:r>
+              <m:t>a</m:t>
+            </m:r>
+          </m:sub>
+        </m:sSub>
+        <m:r>
+          <m:rPr>
+            <m:sty m:val="p"/>
+          </m:rPr>
+          <m:t>=</m:t>
+        </m:r>
+        <m:r>
+          <m:t>L</m:t>
+        </m:r>
+        <m:r>
+          <m:rPr>
+            <m:sty m:val="p"/>
+          </m:rPr>
+          <m:t>=</m:t>
+        </m:r>
+        <m:r>
+          <m:t>0</m:t>
+        </m:r>
+      </m:oMath>
+      <w:r>
+        <w:t xml:space="preserve">, derives the potential in Equation (16), and immediately</w:t>
+      </w:r>
+      <w:r>
+        <w:t xml:space="preserve"> </w:t>
+      </w:r>
+      <w:r>
+        <w:t xml:space="preserve">states that the resulting axial frequencies are conditional model results</w:t>
+      </w:r>
+      <w:r>
+        <w:t xml:space="preserve"> </w:t>
+      </w:r>
+      <w:r>
+        <w:t xml:space="preserve">rather than unique predictions of a nonspherical KS quantum theory.</w:t>
       </w:r>
     </w:p>
     <w:p>
@@ -4546,13 +4438,13 @@
         <w:t xml:space="preserve"> </w:t>
       </w:r>
       <w:r>
-        <w:t xml:space="preserve">row. Both the clean and marked 30-page manuscripts</w:t>
-      </w:r>
-      <w:r>
-        <w:t xml:space="preserve"> </w:t>
-      </w:r>
-      <w:r>
-        <w:t xml:space="preserve">compile independently.</w:t>
+        <w:t xml:space="preserve">row. The clean 30-page manuscript and the marked</w:t>
+      </w:r>
+      <w:r>
+        <w:t xml:space="preserve"> </w:t>
+      </w:r>
+      <w:r>
+        <w:t xml:space="preserve">31-page manuscript compile independently.</w:t>
       </w:r>
     </w:p>
     <w:bookmarkEnd w:id="23"/>

</xml_diff>

<commit_message>
Harden final response equation rendering
</commit_message>
<xml_diff>
--- a/papers/CQG_116364_SUBMIT_THESE_5_FILES/CQG_116364_response_to_referees.docx
+++ b/papers/CQG_116364_SUBMIT_THESE_5_FILES/CQG_116364_response_to_referees.docx
@@ -2912,103 +2912,8 @@
       <w:r>
         <w:t xml:space="preserve"> </w:t>
       </w:r>
-      <m:oMath>
-        <m:r>
-          <m:t>Q</m:t>
-        </m:r>
-        <m:r>
-          <m:rPr>
-            <m:sty m:val="p"/>
-          </m:rPr>
-          <m:t>=</m:t>
-        </m:r>
-        <m:r>
-          <m:rPr>
-            <m:sty m:val="p"/>
-          </m:rPr>
-          <m:t>Re</m:t>
-        </m:r>
-        <m:r>
-          <m:rPr>
-            <m:sty m:val="p"/>
-          </m:rPr>
-          <m:t>(</m:t>
-        </m:r>
-        <m:r>
-          <m:t>ω</m:t>
-        </m:r>
-        <m:r>
-          <m:rPr>
-            <m:sty m:val="p"/>
-          </m:rPr>
-          <m:t>)</m:t>
-        </m:r>
-        <m:r>
-          <m:rPr>
-            <m:sty m:val="p"/>
-          </m:rPr>
-          <m:t>/</m:t>
-        </m:r>
-        <m:r>
-          <m:rPr>
-            <m:sty m:val="p"/>
-          </m:rPr>
-          <m:t>(</m:t>
-        </m:r>
-        <m:r>
-          <m:t>2</m:t>
-        </m:r>
-        <m:r>
-          <m:rPr>
-            <m:sty m:val="p"/>
-          </m:rPr>
-          <m:t>|</m:t>
-        </m:r>
-        <m:r>
-          <m:rPr>
-            <m:sty m:val="p"/>
-          </m:rPr>
-          <m:t>−</m:t>
-        </m:r>
-        <m:r>
-          <m:rPr>
-            <m:sty m:val="p"/>
-          </m:rPr>
-          <m:t>Im</m:t>
-        </m:r>
-        <m:r>
-          <m:rPr>
-            <m:sty m:val="p"/>
-          </m:rPr>
-          <m:t>(</m:t>
-        </m:r>
-        <m:r>
-          <m:t>ω</m:t>
-        </m:r>
-        <m:r>
-          <m:rPr>
-            <m:sty m:val="p"/>
-          </m:rPr>
-          <m:t>)</m:t>
-        </m:r>
-        <m:r>
-          <m:rPr>
-            <m:sty m:val="p"/>
-          </m:rPr>
-          <m:t>|</m:t>
-        </m:r>
-        <m:r>
-          <m:rPr>
-            <m:sty m:val="p"/>
-          </m:rPr>
-          <m:t>)</m:t>
-        </m:r>
-      </m:oMath>
-      <w:r>
-        <w:t xml:space="preserve"> </w:t>
-      </w:r>
-      <w:r>
-        <w:t xml:space="preserve">as a key</w:t>
+      <w:r>
+        <w:t xml:space="preserve">Q = Re(ω)/[2|Im(ω)|] as a key</w:t>
       </w:r>
       <w:r>
         <w:t xml:space="preserve"> </w:t>

</xml_diff>